<commit_message>
actualización a versión 1.5
</commit_message>
<xml_diff>
--- a/ilum/plantillas/Informe_TomaMedicionesIluminacion.docx
+++ b/ilum/plantillas/Informe_TomaMedicionesIluminacion.docx
@@ -220,6 +220,17 @@
                 <w:lang w:val="es-AR"/>
               </w:rPr>
             </w:pPr>
+            <w:r>
+              <w:rPr>
+                <w:rFonts w:ascii="Times New Roman" w:eastAsiaTheme="minorEastAsia" w:hAnsi="Times New Roman" w:cs="Times New Roman"/>
+                <w:noProof/>
+                <w:color w:val="auto"/>
+                <w:sz w:val="22"/>
+                <w:szCs w:val="22"/>
+                <w:lang w:val="en-US"/>
+              </w:rPr>
+              <w:t>{lugar}</w:t>
+            </w:r>
           </w:p>
         </w:tc>
       </w:tr>
@@ -281,6 +292,17 @@
                 <w:lang w:val="es-AR"/>
               </w:rPr>
             </w:pPr>
+            <w:r>
+              <w:rPr>
+                <w:rFonts w:ascii="Times New Roman" w:eastAsiaTheme="minorEastAsia" w:hAnsi="Times New Roman" w:cs="Times New Roman"/>
+                <w:noProof/>
+                <w:color w:val="auto"/>
+                <w:sz w:val="22"/>
+                <w:szCs w:val="22"/>
+                <w:lang w:val="en-US"/>
+              </w:rPr>
+              <w:t>{operador}</w:t>
+            </w:r>
           </w:p>
         </w:tc>
       </w:tr>
@@ -338,9 +360,23 @@
               <w:rPr>
                 <w:rFonts w:ascii="Times New Roman" w:eastAsiaTheme="minorEastAsia" w:hAnsi="Times New Roman" w:cs="Times New Roman"/>
                 <w:noProof/>
-                <w:lang w:val="es-AR"/>
+                <w:color w:val="auto"/>
+                <w:sz w:val="22"/>
+                <w:szCs w:val="22"/>
+                <w:lang w:val="en-US"/>
               </w:rPr>
             </w:pPr>
+            <w:r>
+              <w:rPr>
+                <w:rFonts w:ascii="Times New Roman" w:eastAsiaTheme="minorEastAsia" w:hAnsi="Times New Roman" w:cs="Times New Roman"/>
+                <w:noProof/>
+                <w:color w:val="auto"/>
+                <w:sz w:val="22"/>
+                <w:szCs w:val="22"/>
+                <w:lang w:val="en-US"/>
+              </w:rPr>
+              <w:t>{fechaHora}</w:t>
+            </w:r>
           </w:p>
         </w:tc>
       </w:tr>
@@ -2395,7 +2431,6 @@
                               <w:tc>
                                 <w:tcPr>
                                   <w:tcW w:w="433" w:type="dxa"/>
-                                  <w:shd w:val="clear" w:color="auto" w:fill="auto"/>
                                   <w:vAlign w:val="center"/>
                                 </w:tcPr>
                                 <w:p>
@@ -2417,7 +2452,6 @@
                               <w:tc>
                                 <w:tcPr>
                                   <w:tcW w:w="1050" w:type="dxa"/>
-                                  <w:shd w:val="clear" w:color="auto" w:fill="auto"/>
                                   <w:vAlign w:val="center"/>
                                 </w:tcPr>
                                 <w:p>
@@ -2510,7 +2544,6 @@
                               <w:tc>
                                 <w:tcPr>
                                   <w:tcW w:w="433" w:type="dxa"/>
-                                  <w:shd w:val="clear" w:color="auto" w:fill="auto"/>
                                   <w:vAlign w:val="center"/>
                                 </w:tcPr>
                                 <w:p>
@@ -2532,7 +2565,6 @@
                               <w:tc>
                                 <w:tcPr>
                                   <w:tcW w:w="1050" w:type="dxa"/>
-                                  <w:shd w:val="clear" w:color="auto" w:fill="auto"/>
                                 </w:tcPr>
                                 <w:p>
                                   <w:pPr>
@@ -2625,7 +2657,6 @@
                               <w:tc>
                                 <w:tcPr>
                                   <w:tcW w:w="433" w:type="dxa"/>
-                                  <w:shd w:val="clear" w:color="auto" w:fill="auto"/>
                                   <w:vAlign w:val="center"/>
                                 </w:tcPr>
                                 <w:p>
@@ -2647,7 +2678,6 @@
                               <w:tc>
                                 <w:tcPr>
                                   <w:tcW w:w="1050" w:type="dxa"/>
-                                  <w:shd w:val="clear" w:color="auto" w:fill="auto"/>
                                 </w:tcPr>
                                 <w:p>
                                   <w:pPr>
@@ -2740,7 +2770,6 @@
                               <w:tc>
                                 <w:tcPr>
                                   <w:tcW w:w="433" w:type="dxa"/>
-                                  <w:shd w:val="clear" w:color="auto" w:fill="auto"/>
                                   <w:vAlign w:val="center"/>
                                 </w:tcPr>
                                 <w:p>
@@ -2762,7 +2791,6 @@
                               <w:tc>
                                 <w:tcPr>
                                   <w:tcW w:w="1050" w:type="dxa"/>
-                                  <w:shd w:val="clear" w:color="auto" w:fill="auto"/>
                                 </w:tcPr>
                                 <w:p>
                                   <w:pPr>
@@ -2855,7 +2883,6 @@
                               <w:tc>
                                 <w:tcPr>
                                   <w:tcW w:w="433" w:type="dxa"/>
-                                  <w:shd w:val="clear" w:color="auto" w:fill="auto"/>
                                   <w:vAlign w:val="center"/>
                                 </w:tcPr>
                                 <w:p>
@@ -2877,7 +2904,6 @@
                               <w:tc>
                                 <w:tcPr>
                                   <w:tcW w:w="1050" w:type="dxa"/>
-                                  <w:shd w:val="clear" w:color="auto" w:fill="auto"/>
                                 </w:tcPr>
                                 <w:p>
                                   <w:pPr>
@@ -2970,7 +2996,6 @@
                               <w:tc>
                                 <w:tcPr>
                                   <w:tcW w:w="433" w:type="dxa"/>
-                                  <w:shd w:val="clear" w:color="auto" w:fill="auto"/>
                                   <w:vAlign w:val="center"/>
                                 </w:tcPr>
                                 <w:p>
@@ -2992,7 +3017,6 @@
                               <w:tc>
                                 <w:tcPr>
                                   <w:tcW w:w="1050" w:type="dxa"/>
-                                  <w:shd w:val="clear" w:color="auto" w:fill="auto"/>
                                 </w:tcPr>
                                 <w:p>
                                   <w:pPr>
@@ -3085,7 +3109,6 @@
                               <w:tc>
                                 <w:tcPr>
                                   <w:tcW w:w="433" w:type="dxa"/>
-                                  <w:shd w:val="clear" w:color="auto" w:fill="auto"/>
                                   <w:vAlign w:val="center"/>
                                 </w:tcPr>
                                 <w:p>
@@ -3107,7 +3130,6 @@
                               <w:tc>
                                 <w:tcPr>
                                   <w:tcW w:w="1050" w:type="dxa"/>
-                                  <w:shd w:val="clear" w:color="auto" w:fill="auto"/>
                                 </w:tcPr>
                                 <w:p>
                                   <w:pPr>
@@ -3200,7 +3222,6 @@
                               <w:tc>
                                 <w:tcPr>
                                   <w:tcW w:w="433" w:type="dxa"/>
-                                  <w:shd w:val="clear" w:color="auto" w:fill="auto"/>
                                   <w:vAlign w:val="center"/>
                                 </w:tcPr>
                                 <w:p>
@@ -3222,7 +3243,6 @@
                               <w:tc>
                                 <w:tcPr>
                                   <w:tcW w:w="1050" w:type="dxa"/>
-                                  <w:shd w:val="clear" w:color="auto" w:fill="auto"/>
                                 </w:tcPr>
                                 <w:p>
                                   <w:pPr>
@@ -3315,7 +3335,6 @@
                               <w:tc>
                                 <w:tcPr>
                                   <w:tcW w:w="433" w:type="dxa"/>
-                                  <w:shd w:val="clear" w:color="auto" w:fill="auto"/>
                                   <w:vAlign w:val="center"/>
                                 </w:tcPr>
                                 <w:p>
@@ -3337,7 +3356,6 @@
                               <w:tc>
                                 <w:tcPr>
                                   <w:tcW w:w="1050" w:type="dxa"/>
-                                  <w:shd w:val="clear" w:color="auto" w:fill="auto"/>
                                 </w:tcPr>
                                 <w:p>
                                   <w:pPr>
@@ -3430,7 +3448,6 @@
                               <w:tc>
                                 <w:tcPr>
                                   <w:tcW w:w="433" w:type="dxa"/>
-                                  <w:shd w:val="clear" w:color="auto" w:fill="auto"/>
                                   <w:vAlign w:val="center"/>
                                 </w:tcPr>
                                 <w:p>
@@ -3452,7 +3469,6 @@
                               <w:tc>
                                 <w:tcPr>
                                   <w:tcW w:w="1050" w:type="dxa"/>
-                                  <w:shd w:val="clear" w:color="auto" w:fill="auto"/>
                                 </w:tcPr>
                                 <w:p>
                                   <w:pPr>
@@ -3545,7 +3561,6 @@
                               <w:tc>
                                 <w:tcPr>
                                   <w:tcW w:w="433" w:type="dxa"/>
-                                  <w:shd w:val="clear" w:color="auto" w:fill="auto"/>
                                   <w:vAlign w:val="center"/>
                                 </w:tcPr>
                                 <w:p>
@@ -3567,7 +3582,6 @@
                               <w:tc>
                                 <w:tcPr>
                                   <w:tcW w:w="1050" w:type="dxa"/>
-                                  <w:shd w:val="clear" w:color="auto" w:fill="auto"/>
                                 </w:tcPr>
                                 <w:p>
                                   <w:pPr>
@@ -3660,7 +3674,6 @@
                               <w:tc>
                                 <w:tcPr>
                                   <w:tcW w:w="433" w:type="dxa"/>
-                                  <w:shd w:val="clear" w:color="auto" w:fill="auto"/>
                                   <w:vAlign w:val="center"/>
                                 </w:tcPr>
                                 <w:p>
@@ -3682,7 +3695,6 @@
                               <w:tc>
                                 <w:tcPr>
                                   <w:tcW w:w="1050" w:type="dxa"/>
-                                  <w:shd w:val="clear" w:color="auto" w:fill="auto"/>
                                 </w:tcPr>
                                 <w:p>
                                   <w:pPr>
@@ -3775,7 +3787,6 @@
                               <w:tc>
                                 <w:tcPr>
                                   <w:tcW w:w="433" w:type="dxa"/>
-                                  <w:shd w:val="clear" w:color="auto" w:fill="auto"/>
                                   <w:vAlign w:val="center"/>
                                 </w:tcPr>
                                 <w:p>
@@ -3797,7 +3808,6 @@
                               <w:tc>
                                 <w:tcPr>
                                   <w:tcW w:w="1050" w:type="dxa"/>
-                                  <w:shd w:val="clear" w:color="auto" w:fill="auto"/>
                                 </w:tcPr>
                                 <w:p>
                                   <w:pPr>
@@ -3890,7 +3900,6 @@
                               <w:tc>
                                 <w:tcPr>
                                   <w:tcW w:w="433" w:type="dxa"/>
-                                  <w:shd w:val="clear" w:color="auto" w:fill="auto"/>
                                   <w:vAlign w:val="center"/>
                                 </w:tcPr>
                                 <w:p>
@@ -3912,7 +3921,6 @@
                               <w:tc>
                                 <w:tcPr>
                                   <w:tcW w:w="1050" w:type="dxa"/>
-                                  <w:shd w:val="clear" w:color="auto" w:fill="auto"/>
                                 </w:tcPr>
                                 <w:p>
                                   <w:pPr>
@@ -4005,7 +4013,6 @@
                               <w:tc>
                                 <w:tcPr>
                                   <w:tcW w:w="433" w:type="dxa"/>
-                                  <w:shd w:val="clear" w:color="auto" w:fill="auto"/>
                                   <w:vAlign w:val="center"/>
                                 </w:tcPr>
                                 <w:p>
@@ -4027,7 +4034,6 @@
                               <w:tc>
                                 <w:tcPr>
                                   <w:tcW w:w="1050" w:type="dxa"/>
-                                  <w:shd w:val="clear" w:color="auto" w:fill="auto"/>
                                 </w:tcPr>
                                 <w:p>
                                   <w:pPr>
@@ -4132,7 +4138,6 @@
                               <w:tc>
                                 <w:tcPr>
                                   <w:tcW w:w="433" w:type="dxa"/>
-                                  <w:shd w:val="clear" w:color="auto" w:fill="auto"/>
                                   <w:vAlign w:val="center"/>
                                 </w:tcPr>
                                 <w:p>
@@ -4154,7 +4159,6 @@
                               <w:tc>
                                 <w:tcPr>
                                   <w:tcW w:w="1050" w:type="dxa"/>
-                                  <w:shd w:val="clear" w:color="auto" w:fill="auto"/>
                                 </w:tcPr>
                                 <w:p>
                                   <w:pPr>
@@ -4259,7 +4263,6 @@
                               <w:tc>
                                 <w:tcPr>
                                   <w:tcW w:w="433" w:type="dxa"/>
-                                  <w:shd w:val="clear" w:color="auto" w:fill="auto"/>
                                   <w:vAlign w:val="center"/>
                                 </w:tcPr>
                                 <w:p>
@@ -4281,7 +4284,6 @@
                               <w:tc>
                                 <w:tcPr>
                                   <w:tcW w:w="1050" w:type="dxa"/>
-                                  <w:shd w:val="clear" w:color="auto" w:fill="auto"/>
                                 </w:tcPr>
                                 <w:p>
                                   <w:pPr>
@@ -4386,7 +4388,6 @@
                               <w:tc>
                                 <w:tcPr>
                                   <w:tcW w:w="433" w:type="dxa"/>
-                                  <w:shd w:val="clear" w:color="auto" w:fill="auto"/>
                                   <w:vAlign w:val="center"/>
                                 </w:tcPr>
                                 <w:p>
@@ -4408,7 +4409,6 @@
                               <w:tc>
                                 <w:tcPr>
                                   <w:tcW w:w="1050" w:type="dxa"/>
-                                  <w:shd w:val="clear" w:color="auto" w:fill="auto"/>
                                 </w:tcPr>
                                 <w:p>
                                   <w:pPr>
@@ -4513,7 +4513,6 @@
                               <w:tc>
                                 <w:tcPr>
                                   <w:tcW w:w="433" w:type="dxa"/>
-                                  <w:shd w:val="clear" w:color="auto" w:fill="auto"/>
                                   <w:vAlign w:val="center"/>
                                 </w:tcPr>
                                 <w:p>
@@ -4535,7 +4534,6 @@
                               <w:tc>
                                 <w:tcPr>
                                   <w:tcW w:w="1050" w:type="dxa"/>
-                                  <w:shd w:val="clear" w:color="auto" w:fill="auto"/>
                                 </w:tcPr>
                                 <w:p>
                                   <w:pPr>
@@ -4640,7 +4638,6 @@
                               <w:tc>
                                 <w:tcPr>
                                   <w:tcW w:w="433" w:type="dxa"/>
-                                  <w:shd w:val="clear" w:color="auto" w:fill="auto"/>
                                   <w:vAlign w:val="center"/>
                                 </w:tcPr>
                                 <w:p>
@@ -4662,7 +4659,6 @@
                               <w:tc>
                                 <w:tcPr>
                                   <w:tcW w:w="1050" w:type="dxa"/>
-                                  <w:shd w:val="clear" w:color="auto" w:fill="auto"/>
                                 </w:tcPr>
                                 <w:p>
                                   <w:pPr>
@@ -4781,7 +4777,11 @@
           </mc:Choice>
           <mc:Fallback>
             <w:pict>
-              <v:shape w14:anchorId="05CD84C8" id="Cuadro de texto 13" o:spid="_x0000_s1030" type="#_x0000_t202" style="position:absolute;left:0;text-align:left;margin-left:387.8pt;margin-top:5.45pt;width:168.4pt;height:304.4pt;z-index:251694080;visibility:visible;mso-wrap-style:square;mso-width-percent:0;mso-height-percent:0;mso-wrap-distance-left:9pt;mso-wrap-distance-top:0;mso-wrap-distance-right:9pt;mso-wrap-distance-bottom:0;mso-position-horizontal:absolute;mso-position-horizontal-relative:text;mso-position-vertical:absolute;mso-position-vertical-relative:text;mso-width-percent:0;mso-height-percent:0;mso-width-relative:margin;mso-height-relative:margin;v-text-anchor:top" o:gfxdata="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" stroked="f">
+              <v:shapetype w14:anchorId="05CD84C8" id="_x0000_t202" coordsize="21600,21600" o:spt="202" path="m,l,21600r21600,l21600,xe">
+                <v:stroke joinstyle="miter"/>
+                <v:path gradientshapeok="t" o:connecttype="rect"/>
+              </v:shapetype>
+              <v:shape id="Cuadro de texto 13" o:spid="_x0000_s1030" type="#_x0000_t202" style="position:absolute;left:0;text-align:left;margin-left:387.8pt;margin-top:5.45pt;width:168.4pt;height:304.4pt;z-index:251694080;visibility:visible;mso-wrap-style:square;mso-width-percent:0;mso-height-percent:0;mso-wrap-distance-left:9pt;mso-wrap-distance-top:0;mso-wrap-distance-right:9pt;mso-wrap-distance-bottom:0;mso-position-horizontal:absolute;mso-position-horizontal-relative:text;mso-position-vertical:absolute;mso-position-vertical-relative:text;mso-width-percent:0;mso-height-percent:0;mso-width-relative:margin;mso-height-relative:margin;v-text-anchor:top" o:gfxdata="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" stroked="f">
                 <v:textbox>
                   <w:txbxContent>
                     <w:tbl>
@@ -4894,7 +4894,6 @@
                         <w:tc>
                           <w:tcPr>
                             <w:tcW w:w="433" w:type="dxa"/>
-                            <w:shd w:val="clear" w:color="auto" w:fill="auto"/>
                             <w:vAlign w:val="center"/>
                           </w:tcPr>
                           <w:p>
@@ -4916,7 +4915,6 @@
                         <w:tc>
                           <w:tcPr>
                             <w:tcW w:w="1050" w:type="dxa"/>
-                            <w:shd w:val="clear" w:color="auto" w:fill="auto"/>
                             <w:vAlign w:val="center"/>
                           </w:tcPr>
                           <w:p>
@@ -5009,7 +5007,6 @@
                         <w:tc>
                           <w:tcPr>
                             <w:tcW w:w="433" w:type="dxa"/>
-                            <w:shd w:val="clear" w:color="auto" w:fill="auto"/>
                             <w:vAlign w:val="center"/>
                           </w:tcPr>
                           <w:p>
@@ -5031,7 +5028,6 @@
                         <w:tc>
                           <w:tcPr>
                             <w:tcW w:w="1050" w:type="dxa"/>
-                            <w:shd w:val="clear" w:color="auto" w:fill="auto"/>
                           </w:tcPr>
                           <w:p>
                             <w:pPr>
@@ -5124,7 +5120,6 @@
                         <w:tc>
                           <w:tcPr>
                             <w:tcW w:w="433" w:type="dxa"/>
-                            <w:shd w:val="clear" w:color="auto" w:fill="auto"/>
                             <w:vAlign w:val="center"/>
                           </w:tcPr>
                           <w:p>
@@ -5146,7 +5141,6 @@
                         <w:tc>
                           <w:tcPr>
                             <w:tcW w:w="1050" w:type="dxa"/>
-                            <w:shd w:val="clear" w:color="auto" w:fill="auto"/>
                           </w:tcPr>
                           <w:p>
                             <w:pPr>
@@ -5239,7 +5233,6 @@
                         <w:tc>
                           <w:tcPr>
                             <w:tcW w:w="433" w:type="dxa"/>
-                            <w:shd w:val="clear" w:color="auto" w:fill="auto"/>
                             <w:vAlign w:val="center"/>
                           </w:tcPr>
                           <w:p>
@@ -5261,7 +5254,6 @@
                         <w:tc>
                           <w:tcPr>
                             <w:tcW w:w="1050" w:type="dxa"/>
-                            <w:shd w:val="clear" w:color="auto" w:fill="auto"/>
                           </w:tcPr>
                           <w:p>
                             <w:pPr>
@@ -5354,7 +5346,6 @@
                         <w:tc>
                           <w:tcPr>
                             <w:tcW w:w="433" w:type="dxa"/>
-                            <w:shd w:val="clear" w:color="auto" w:fill="auto"/>
                             <w:vAlign w:val="center"/>
                           </w:tcPr>
                           <w:p>
@@ -5376,7 +5367,6 @@
                         <w:tc>
                           <w:tcPr>
                             <w:tcW w:w="1050" w:type="dxa"/>
-                            <w:shd w:val="clear" w:color="auto" w:fill="auto"/>
                           </w:tcPr>
                           <w:p>
                             <w:pPr>
@@ -5469,7 +5459,6 @@
                         <w:tc>
                           <w:tcPr>
                             <w:tcW w:w="433" w:type="dxa"/>
-                            <w:shd w:val="clear" w:color="auto" w:fill="auto"/>
                             <w:vAlign w:val="center"/>
                           </w:tcPr>
                           <w:p>
@@ -5491,7 +5480,6 @@
                         <w:tc>
                           <w:tcPr>
                             <w:tcW w:w="1050" w:type="dxa"/>
-                            <w:shd w:val="clear" w:color="auto" w:fill="auto"/>
                           </w:tcPr>
                           <w:p>
                             <w:pPr>
@@ -5584,7 +5572,6 @@
                         <w:tc>
                           <w:tcPr>
                             <w:tcW w:w="433" w:type="dxa"/>
-                            <w:shd w:val="clear" w:color="auto" w:fill="auto"/>
                             <w:vAlign w:val="center"/>
                           </w:tcPr>
                           <w:p>
@@ -5606,7 +5593,6 @@
                         <w:tc>
                           <w:tcPr>
                             <w:tcW w:w="1050" w:type="dxa"/>
-                            <w:shd w:val="clear" w:color="auto" w:fill="auto"/>
                           </w:tcPr>
                           <w:p>
                             <w:pPr>
@@ -5699,7 +5685,6 @@
                         <w:tc>
                           <w:tcPr>
                             <w:tcW w:w="433" w:type="dxa"/>
-                            <w:shd w:val="clear" w:color="auto" w:fill="auto"/>
                             <w:vAlign w:val="center"/>
                           </w:tcPr>
                           <w:p>
@@ -5721,7 +5706,6 @@
                         <w:tc>
                           <w:tcPr>
                             <w:tcW w:w="1050" w:type="dxa"/>
-                            <w:shd w:val="clear" w:color="auto" w:fill="auto"/>
                           </w:tcPr>
                           <w:p>
                             <w:pPr>
@@ -5814,7 +5798,6 @@
                         <w:tc>
                           <w:tcPr>
                             <w:tcW w:w="433" w:type="dxa"/>
-                            <w:shd w:val="clear" w:color="auto" w:fill="auto"/>
                             <w:vAlign w:val="center"/>
                           </w:tcPr>
                           <w:p>
@@ -5836,7 +5819,6 @@
                         <w:tc>
                           <w:tcPr>
                             <w:tcW w:w="1050" w:type="dxa"/>
-                            <w:shd w:val="clear" w:color="auto" w:fill="auto"/>
                           </w:tcPr>
                           <w:p>
                             <w:pPr>
@@ -5929,7 +5911,6 @@
                         <w:tc>
                           <w:tcPr>
                             <w:tcW w:w="433" w:type="dxa"/>
-                            <w:shd w:val="clear" w:color="auto" w:fill="auto"/>
                             <w:vAlign w:val="center"/>
                           </w:tcPr>
                           <w:p>
@@ -5951,7 +5932,6 @@
                         <w:tc>
                           <w:tcPr>
                             <w:tcW w:w="1050" w:type="dxa"/>
-                            <w:shd w:val="clear" w:color="auto" w:fill="auto"/>
                           </w:tcPr>
                           <w:p>
                             <w:pPr>
@@ -6044,7 +6024,6 @@
                         <w:tc>
                           <w:tcPr>
                             <w:tcW w:w="433" w:type="dxa"/>
-                            <w:shd w:val="clear" w:color="auto" w:fill="auto"/>
                             <w:vAlign w:val="center"/>
                           </w:tcPr>
                           <w:p>
@@ -6066,7 +6045,6 @@
                         <w:tc>
                           <w:tcPr>
                             <w:tcW w:w="1050" w:type="dxa"/>
-                            <w:shd w:val="clear" w:color="auto" w:fill="auto"/>
                           </w:tcPr>
                           <w:p>
                             <w:pPr>
@@ -6159,7 +6137,6 @@
                         <w:tc>
                           <w:tcPr>
                             <w:tcW w:w="433" w:type="dxa"/>
-                            <w:shd w:val="clear" w:color="auto" w:fill="auto"/>
                             <w:vAlign w:val="center"/>
                           </w:tcPr>
                           <w:p>
@@ -6181,7 +6158,6 @@
                         <w:tc>
                           <w:tcPr>
                             <w:tcW w:w="1050" w:type="dxa"/>
-                            <w:shd w:val="clear" w:color="auto" w:fill="auto"/>
                           </w:tcPr>
                           <w:p>
                             <w:pPr>
@@ -6274,7 +6250,6 @@
                         <w:tc>
                           <w:tcPr>
                             <w:tcW w:w="433" w:type="dxa"/>
-                            <w:shd w:val="clear" w:color="auto" w:fill="auto"/>
                             <w:vAlign w:val="center"/>
                           </w:tcPr>
                           <w:p>
@@ -6296,7 +6271,6 @@
                         <w:tc>
                           <w:tcPr>
                             <w:tcW w:w="1050" w:type="dxa"/>
-                            <w:shd w:val="clear" w:color="auto" w:fill="auto"/>
                           </w:tcPr>
                           <w:p>
                             <w:pPr>
@@ -6389,7 +6363,6 @@
                         <w:tc>
                           <w:tcPr>
                             <w:tcW w:w="433" w:type="dxa"/>
-                            <w:shd w:val="clear" w:color="auto" w:fill="auto"/>
                             <w:vAlign w:val="center"/>
                           </w:tcPr>
                           <w:p>
@@ -6411,7 +6384,6 @@
                         <w:tc>
                           <w:tcPr>
                             <w:tcW w:w="1050" w:type="dxa"/>
-                            <w:shd w:val="clear" w:color="auto" w:fill="auto"/>
                           </w:tcPr>
                           <w:p>
                             <w:pPr>
@@ -6504,7 +6476,6 @@
                         <w:tc>
                           <w:tcPr>
                             <w:tcW w:w="433" w:type="dxa"/>
-                            <w:shd w:val="clear" w:color="auto" w:fill="auto"/>
                             <w:vAlign w:val="center"/>
                           </w:tcPr>
                           <w:p>
@@ -6526,7 +6497,6 @@
                         <w:tc>
                           <w:tcPr>
                             <w:tcW w:w="1050" w:type="dxa"/>
-                            <w:shd w:val="clear" w:color="auto" w:fill="auto"/>
                           </w:tcPr>
                           <w:p>
                             <w:pPr>
@@ -6631,7 +6601,6 @@
                         <w:tc>
                           <w:tcPr>
                             <w:tcW w:w="433" w:type="dxa"/>
-                            <w:shd w:val="clear" w:color="auto" w:fill="auto"/>
                             <w:vAlign w:val="center"/>
                           </w:tcPr>
                           <w:p>
@@ -6653,7 +6622,6 @@
                         <w:tc>
                           <w:tcPr>
                             <w:tcW w:w="1050" w:type="dxa"/>
-                            <w:shd w:val="clear" w:color="auto" w:fill="auto"/>
                           </w:tcPr>
                           <w:p>
                             <w:pPr>
@@ -6758,7 +6726,6 @@
                         <w:tc>
                           <w:tcPr>
                             <w:tcW w:w="433" w:type="dxa"/>
-                            <w:shd w:val="clear" w:color="auto" w:fill="auto"/>
                             <w:vAlign w:val="center"/>
                           </w:tcPr>
                           <w:p>
@@ -6780,7 +6747,6 @@
                         <w:tc>
                           <w:tcPr>
                             <w:tcW w:w="1050" w:type="dxa"/>
-                            <w:shd w:val="clear" w:color="auto" w:fill="auto"/>
                           </w:tcPr>
                           <w:p>
                             <w:pPr>
@@ -6885,7 +6851,6 @@
                         <w:tc>
                           <w:tcPr>
                             <w:tcW w:w="433" w:type="dxa"/>
-                            <w:shd w:val="clear" w:color="auto" w:fill="auto"/>
                             <w:vAlign w:val="center"/>
                           </w:tcPr>
                           <w:p>
@@ -6907,7 +6872,6 @@
                         <w:tc>
                           <w:tcPr>
                             <w:tcW w:w="1050" w:type="dxa"/>
-                            <w:shd w:val="clear" w:color="auto" w:fill="auto"/>
                           </w:tcPr>
                           <w:p>
                             <w:pPr>
@@ -7012,7 +6976,6 @@
                         <w:tc>
                           <w:tcPr>
                             <w:tcW w:w="433" w:type="dxa"/>
-                            <w:shd w:val="clear" w:color="auto" w:fill="auto"/>
                             <w:vAlign w:val="center"/>
                           </w:tcPr>
                           <w:p>
@@ -7034,7 +6997,6 @@
                         <w:tc>
                           <w:tcPr>
                             <w:tcW w:w="1050" w:type="dxa"/>
-                            <w:shd w:val="clear" w:color="auto" w:fill="auto"/>
                           </w:tcPr>
                           <w:p>
                             <w:pPr>
@@ -7139,7 +7101,6 @@
                         <w:tc>
                           <w:tcPr>
                             <w:tcW w:w="433" w:type="dxa"/>
-                            <w:shd w:val="clear" w:color="auto" w:fill="auto"/>
                             <w:vAlign w:val="center"/>
                           </w:tcPr>
                           <w:p>
@@ -7161,7 +7122,6 @@
                         <w:tc>
                           <w:tcPr>
                             <w:tcW w:w="1050" w:type="dxa"/>
-                            <w:shd w:val="clear" w:color="auto" w:fill="auto"/>
                           </w:tcPr>
                           <w:p>
                             <w:pPr>
@@ -7937,8 +7897,20 @@
                                 <w:szCs w:val="28"/>
                                 <w:lang w:val="es-AR"/>
                               </w:rPr>
-                              <w:t xml:space="preserve">  Artificial /  Mixta</w:t>
-                            </w:r>
+                              <w:t xml:space="preserve">  Artificial </w:t>
+                            </w:r>
+                            <w:proofErr w:type="gramStart"/>
+                            <w:r>
+                              <w:rPr>
+                                <w:i/>
+                                <w:color w:val="000000"/>
+                                <w:sz w:val="28"/>
+                                <w:szCs w:val="28"/>
+                                <w:lang w:val="es-AR"/>
+                              </w:rPr>
+                              <w:t>/  Mixta</w:t>
+                            </w:r>
+                            <w:proofErr w:type="gramEnd"/>
                           </w:p>
                           <w:p/>
                         </w:txbxContent>
@@ -12246,7 +12218,6 @@
   <w:style w:type="character" w:default="1" w:styleId="Fuentedeprrafopredeter">
     <w:name w:val="Default Paragraph Font"/>
     <w:uiPriority w:val="1"/>
-    <w:semiHidden/>
     <w:unhideWhenUsed/>
   </w:style>
   <w:style w:type="table" w:default="1" w:styleId="Tablanormal">

</xml_diff>